<commit_message>
Reformat review to POWER-D house style (opening + flat bullets)
Drop the Summary/Major/Minor/Recommendation sectioning per the POWER-D
template: a single opening paragraph (with the "However, several concerns
remain ..." lead) followed by four flat bullets, no headings. Fold the
minor items into one bullet to keep it to ~one page. Carry over the
manual edits from the reference copy (plastic neck; "at low rate" for the
167 mAh/g point; tortuosity-factor exponent on tau), and replace the
formal "jointly govern" opening with a plainer "investigate how ...
affect ..." to match the template's tone.

https://claude.ai/code/session_01H191Ni4xzj9H5ftstAm7Ft
</commit_message>
<xml_diff>
--- a/docs/EA263669_review_comment.docx
+++ b/docs/EA263669_review_comment.docx
@@ -1,11 +1,11 @@
 
 <file path=word/document.xml><?xml version="1.0" encoding="utf-8"?>
-<w:document xmlns:wpc="http://schemas.microsoft.com/office/word/2010/wordprocessingCanvas" xmlns:mc="http://schemas.openxmlformats.org/markup-compatibility/2006" xmlns:o="urn:schemas-microsoft-com:office:office" xmlns:r="http://schemas.openxmlformats.org/officeDocument/2006/relationships" xmlns:m="http://schemas.openxmlformats.org/officeDocument/2006/math" xmlns:v="urn:schemas-microsoft-com:vml" xmlns:wp14="http://schemas.microsoft.com/office/word/2010/wordprocessingDrawing" xmlns:wp="http://schemas.openxmlformats.org/drawingml/2006/wordprocessingDrawing" xmlns:w10="urn:schemas-microsoft-com:office:word" xmlns:w="http://schemas.openxmlformats.org/wordprocessingml/2006/main" xmlns:w14="http://schemas.microsoft.com/office/word/2010/wordml" xmlns:w15="http://schemas.microsoft.com/office/word/2012/wordml" xmlns:wpg="http://schemas.microsoft.com/office/word/2010/wordprocessingGroup" xmlns:wpi="http://schemas.microsoft.com/office/word/2010/wordprocessingInk" xmlns:wne="http://schemas.microsoft.com/office/word/2006/wordml" xmlns:wps="http://schemas.microsoft.com/office/word/2010/wordprocessingShape">
+<w:document xmlns:wpc="http://schemas.microsoft.com/office/word/2010/wordprocessingCanvas" xmlns:cx="http://schemas.microsoft.com/office/drawing/2014/chartex" xmlns:cx1="http://schemas.microsoft.com/office/drawing/2015/9/8/chartex" xmlns:cx2="http://schemas.microsoft.com/office/drawing/2015/10/21/chartex" xmlns:cx3="http://schemas.microsoft.com/office/drawing/2016/5/9/chartex" xmlns:cx4="http://schemas.microsoft.com/office/drawing/2016/5/10/chartex" xmlns:cx5="http://schemas.microsoft.com/office/drawing/2016/5/11/chartex" xmlns:cx6="http://schemas.microsoft.com/office/drawing/2016/5/12/chartex" xmlns:cx7="http://schemas.microsoft.com/office/drawing/2016/5/13/chartex" xmlns:cx8="http://schemas.microsoft.com/office/drawing/2016/5/14/chartex" xmlns:mc="http://schemas.openxmlformats.org/markup-compatibility/2006" xmlns:aink="http://schemas.microsoft.com/office/drawing/2016/ink" xmlns:am3d="http://schemas.microsoft.com/office/drawing/2017/model3d" xmlns:o="urn:schemas-microsoft-com:office:office" xmlns:oel="http://schemas.microsoft.com/office/2019/extlst" xmlns:r="http://schemas.openxmlformats.org/officeDocument/2006/relationships" xmlns:m="http://schemas.openxmlformats.org/officeDocument/2006/math" xmlns:v="urn:schemas-microsoft-com:vml" xmlns:wp14="http://schemas.microsoft.com/office/word/2010/wordprocessingDrawing" xmlns:wp="http://schemas.openxmlformats.org/drawingml/2006/wordprocessingDrawing" xmlns:w10="urn:schemas-microsoft-com:office:word" xmlns:w="http://schemas.openxmlformats.org/wordprocessingml/2006/main" xmlns:w14="http://schemas.microsoft.com/office/word/2010/wordml" xmlns:w15="http://schemas.microsoft.com/office/word/2012/wordml" xmlns:w16cex="http://schemas.microsoft.com/office/word/2018/wordml/cex" xmlns:w16cid="http://schemas.microsoft.com/office/word/2016/wordml/cid" xmlns:w16="http://schemas.microsoft.com/office/word/2018/wordml" xmlns:w16du="http://schemas.microsoft.com/office/word/2023/wordml/word16du" xmlns:w16sdtdh="http://schemas.microsoft.com/office/word/2020/wordml/sdtdatahash" xmlns:w16sdtfl="http://schemas.microsoft.com/office/word/2024/wordml/sdtformatlock" xmlns:w16se="http://schemas.microsoft.com/office/word/2015/wordml/symex" xmlns:wpg="http://schemas.microsoft.com/office/word/2010/wordprocessingGroup" xmlns:wpi="http://schemas.microsoft.com/office/word/2010/wordprocessingInk" xmlns:wne="http://schemas.microsoft.com/office/word/2006/wordml" xmlns:wps="http://schemas.microsoft.com/office/word/2010/wordprocessingShape" mc:Ignorable="w14 w15 w16se w16cid w16 w16cex w16sdtdh w16sdtfl w16du wp14">
   <w:body>
     <w:p>
       <w:pPr>
+        <w:spacing w:after="240"/>
         <w:jc w:val="center"/>
-        <w:spacing w:after="240"/>
         <w:rPr>
           <w:rFonts w:ascii="Times New Roman" w:eastAsia="Times New Roman" w:hAnsi="Times New Roman" w:cs="Times New Roman"/>
         </w:rPr>
@@ -17,15 +17,15 @@
           <w:bCs/>
           <w:sz w:val="24"/>
           <w:szCs w:val="24"/>
-          <w:u w:val="single" w:color="auto"/>
+          <w:u w:val="single"/>
         </w:rPr>
         <w:t>Comments to the Author(s)</w:t>
       </w:r>
     </w:p>
     <w:p>
       <w:pPr>
+        <w:spacing w:after="160" w:line="276" w:lineRule="auto"/>
         <w:jc w:val="both"/>
-        <w:spacing w:after="120" w:line="276" w:lineRule="auto"/>
         <w:rPr>
           <w:rFonts w:ascii="Times New Roman" w:eastAsia="Times New Roman" w:hAnsi="Times New Roman" w:cs="Times New Roman"/>
           <w:sz w:val="24"/>
@@ -38,363 +38,118 @@
           <w:b w:val="0"/>
           <w:sz w:val="24"/>
         </w:rPr>
-        <w:t>Summary</w:t>
+        <w:t>In this study, the authors investigate how the LPSC solid-electrolyte particle size and the CAM/SSE ratio affect ionic and electronic transport and interfacial stability in sulfide all-solid-state composite cathodes, combining electrochemical measurements, in-situ EIS/DRT, SEM/FIB-SEM, and 3D LAMMPS packing simulations. The topic is timely and the manuscript presents a systematic set of results spanning rate capability, cycling, impedance evolution, and microstructural characterization. However, several concerns remain regarding the physical fidelity of the packing simulation, the interpretation of the results, and some of the key claims. The authors should address the following points before publication:</w:t>
       </w:r>
     </w:p>
     <w:p>
       <w:pPr>
+        <w:spacing w:after="160" w:line="276" w:lineRule="auto"/>
         <w:jc w:val="both"/>
-        <w:spacing w:after="120" w:line="276" w:lineRule="auto"/>
         <w:rPr>
           <w:rFonts w:ascii="Times New Roman" w:eastAsia="Times New Roman" w:hAnsi="Times New Roman" w:cs="Times New Roman"/>
           <w:sz w:val="24"/>
           <w:szCs w:val="24"/>
         </w:rPr>
       </w:pPr>
+    </w:p>
+    <w:p>
+      <w:pPr>
+        <w:numPr>
+          <w:ilvl w:val="0"/>
+          <w:numId w:val="1"/>
+        </w:numPr>
+        <w:spacing w:after="200" w:line="276" w:lineRule="auto"/>
+        <w:jc w:val="both"/>
+        <w:rPr>
+          <w:rFonts w:ascii="Times New Roman" w:hAnsi="Times New Roman" w:cs="Times New Roman"/>
+          <w:sz w:val="24"/>
+          <w:szCs w:val="24"/>
+        </w:rPr>
+      </w:pPr>
+      <w:proofErr w:type="gramStart"/>
+      <w:proofErr w:type="gramEnd"/>
       <w:r>
         <w:rPr>
           <w:rFonts w:ascii="Times New Roman" w:hAnsi="Times New Roman"/>
           <w:b w:val="0"/>
           <w:sz w:val="24"/>
         </w:rPr>
-        <w:t>This work examines how LPSC particle size and the CAM/SSE ratio jointly govern ionic and electronic transport and interfacial stability in sulfide all-solid-state composite cathodes, using EIS/DRT, rate-cycling, SEM/FIB-SEM, and a 3D LAMMPS packing simulation. The experimental characterization is systematic and the topic is timely. However, several concerns remain regarding the physical fidelity of the packing simulation, the interpretation of the results, and some of the key claims. The authors should address the following points before publication:</w:t>
+        <w:t>The packing simulation omits plastic deformation, which is the central concern. The claim that fine SSE fills voids and lowers porosity and tortuosity rests on a purely Hertzian-elastic, adhesive packing (“elastic contact moduli”) that is not formulated to capture the plastic flow it invokes: (i) the cathode is pressed at about 240 MPa, at or above the LPSC yield stress (σ_y ≈ 0.05–0.3 GPa), so the elastic law is applied where the material is expected to yield; (ii) an elastic sphere fills voids only geometrically and saturates near its random-packing limit, so it cannot densify by the plastic flow that cold-pressing produces and tends to overestimate the residual porosity (a like-for-like check needs the pristine, not post-cycling, FIB-SEM porosity, which is not reported); (iii) the authors’ own SEM/FIB-SEM, showing filled interstices and boundary flattening, is plastic morphology that the elastic model does not reproduce; (iv) NPT densification of elastic, adhesive spheres is largely reversible (spring-back plus Lennard–Jones clustering), unlike irreversible cold-pressing; (v) elastic point contacts underestimate the plastic neck (A = F/H), which inflates the ionic tortuosity. The absolute values (6.360 vs 3.914) are therefore hard to compare with experiment, although the coarse &gt; fine ordering is reasonable. Please adopt an elastoplastic or hysteretic contact, or present Fig. 2 as a qualitative-trend tool and report the pristine FIB-SEM porosity.</w:t>
       </w:r>
     </w:p>
     <w:p>
       <w:pPr>
+        <w:numPr>
+          <w:ilvl w:val="0"/>
+          <w:numId w:val="1"/>
+        </w:numPr>
+        <w:spacing w:after="200" w:line="276" w:lineRule="auto"/>
         <w:jc w:val="both"/>
-        <w:spacing w:after="0" w:line="276" w:lineRule="auto"/>
-        <w:rPr>
-          <w:rFonts w:ascii="Times New Roman" w:eastAsia="Times New Roman" w:hAnsi="Times New Roman" w:cs="Times New Roman"/>
+        <w:rPr>
+          <w:rFonts w:ascii="Times New Roman" w:hAnsi="Times New Roman" w:cs="Times New Roman"/>
           <w:sz w:val="24"/>
           <w:szCs w:val="24"/>
         </w:rPr>
       </w:pPr>
-    </w:p>
-    <w:p>
-      <w:pPr>
-        <w:jc w:val="both"/>
-        <w:spacing w:after="120" w:line="276" w:lineRule="auto"/>
-        <w:rPr>
-          <w:rFonts w:ascii="Times New Roman" w:eastAsia="Times New Roman" w:hAnsi="Times New Roman" w:cs="Times New Roman"/>
-          <w:sz w:val="24"/>
-          <w:szCs w:val="24"/>
-        </w:rPr>
-      </w:pPr>
+      <w:proofErr w:type="gramStart"/>
+      <w:proofErr w:type="gramEnd"/>
       <w:r>
         <w:rPr>
           <w:rFonts w:ascii="Times New Roman" w:hAnsi="Times New Roman"/>
           <w:b w:val="0"/>
           <w:sz w:val="24"/>
         </w:rPr>
-        <w:t>Major comments</w:t>
+        <w:t>The “molecular-dynamics” framing is not appropriate for micron grains (a 1 fs step, 300 K, and about 0.5 ns total are not meaningful for 0.5–6 µm particles); the calculation is effectively a granular DEM and should be converged and described as such. The 30×30×100 µm cell contains only on the order of ten coarse particles across a section, so please report the unstated composition, the seed count, and the seed-to-seed scatter; the “elastic contact moduli” are also uncalibrated (no stiffness values or comparison with the measured pellet density). The reported geometric tortuosity is, moreover, not the transport tortuosity that enters σ_eff = σ0·ε/τ².</w:t>
       </w:r>
     </w:p>
     <w:p>
       <w:pPr>
+        <w:numPr>
+          <w:ilvl w:val="0"/>
+          <w:numId w:val="1"/>
+        </w:numPr>
+        <w:spacing w:after="200" w:line="276" w:lineRule="auto"/>
         <w:jc w:val="both"/>
-        <w:spacing w:after="120" w:line="276" w:lineRule="auto"/>
-        <w:rPr>
-          <w:rFonts w:ascii="Times New Roman" w:eastAsia="Times New Roman" w:hAnsi="Times New Roman" w:cs="Times New Roman"/>
+        <w:rPr>
+          <w:rFonts w:ascii="Times New Roman" w:hAnsi="Times New Roman" w:cs="Times New Roman"/>
           <w:sz w:val="24"/>
           <w:szCs w:val="24"/>
         </w:rPr>
       </w:pPr>
+      <w:proofErr w:type="gramStart"/>
+      <w:proofErr w:type="gramEnd"/>
       <w:r>
         <w:rPr>
           <w:rFonts w:ascii="Times New Roman" w:hAnsi="Times New Roman"/>
           <w:b w:val="0"/>
           <w:sz w:val="24"/>
         </w:rPr>
-        <w:t>1. The packing simulation does not include plastic deformation, which is my central concern. The claim that fine SSE fills voids and lowers porosity and tortuosity rests on a purely Hertzian-elastic, adhesive packing (“elastic contact moduli”) that is not formulated to capture the plastic flow it invokes. (i) The cathode is densified at about 240 MPa, at or above the LPSC yield stress (σ_y ≈ 0.05–0.3 GPa), so the elastic law is applied in a regime where the material is expected to yield. (ii) An elastic sphere fills voids only geometrically and saturates near its random-packing limit; it cannot densify through the plastic flow that cold-pressing produces, so it will tend to overestimate the residual porosity. A like-for-like check would require the pristine (not post-cycling) FIB-SEM porosity, which is not reported (see Minor 2). (iii) The authors’ own SEM/FIB-SEM (filled interstices, boundary flattening) shows plastic morphology that the elastic model does not reproduce. (iv) Densification of elastic, adhesive spheres under an NPT barostat is largely reversible (elastic spring-back plus Lennard–Jones clustering), unlike the irreversible compaction of cold-pressing. (v) Elastic point contacts underestimate the conducting neck (A = F/H), which inflates the ionic tortuosity. As a result, the absolute porosity and tortuosity values (e.g. 6.360 vs 3.914) are difficult to compare with experiment, although the coarse &gt; fine ordering is reasonable. Please either adopt an elastoplastic or hysteretic contact law, or present Fig. 2 explicitly as a qualitative-trend tool and report the pristine FIB-SEM porosity for a like-for-like comparison.</w:t>
+        <w:t>The “50:50 optimal” claim is a cell-performance optimum that the data do not establish. The conductivity-level ionic/electronic trade-off is already shown in Fig. 1, but no cell with &gt;50 vol% SSE (≤40 vol% NCM90) was cycled, so the electron-limited roll-off that would define an optimum is absent; size and composition are also varied together, confounding coverage with packing. Please either cycle a &gt;50 vol% SSE cell, or restate “50:50 optimal” as “50 outperforms 60 vol% within the studied window.”</w:t>
       </w:r>
     </w:p>
     <w:p>
       <w:pPr>
+        <w:numPr>
+          <w:ilvl w:val="0"/>
+          <w:numId w:val="1"/>
+        </w:numPr>
+        <w:spacing w:after="200" w:line="276" w:lineRule="auto"/>
         <w:jc w:val="both"/>
-        <w:spacing w:after="120" w:line="276" w:lineRule="auto"/>
-        <w:rPr>
-          <w:rFonts w:ascii="Times New Roman" w:eastAsia="Times New Roman" w:hAnsi="Times New Roman" w:cs="Times New Roman"/>
+        <w:rPr>
+          <w:rFonts w:ascii="Times New Roman" w:hAnsi="Times New Roman" w:cs="Times New Roman"/>
           <w:sz w:val="24"/>
           <w:szCs w:val="24"/>
         </w:rPr>
       </w:pPr>
+      <w:proofErr w:type="gramStart"/>
+      <w:proofErr w:type="gramEnd"/>
       <w:r>
         <w:rPr>
           <w:rFonts w:ascii="Times New Roman" w:hAnsi="Times New Roman"/>
           <w:b w:val="0"/>
           <w:sz w:val="24"/>
         </w:rPr>
-        <w:t>2. The simulation should be described and validated more rigorously. The “molecular-dynamics” framing is not appropriate for micron-scale grains (a 1 fs step, 300 K, and about 0.5 ns total are not meaningful for 0.5–6 µm particles); the calculation is effectively a granular DEM and should be described and converged as such. The 30×30×100 µm cell contains only on the order of ten coarse (3–5 µm) particles across a section, so the result is sensitive to the particular realization. The “elastic contact moduli” are mentioned, but no stiffness values, nor any comparison with the measured pellet density, are given, so the packing is uncalibrated. Finally, the reported quantity is a geometric tortuosity (path length divided by straight-line distance), which is not the transport tortuosity that enters σ_eff = σ0·ε/τ. Please describe the model as a granular DEM, demonstrate force convergence and a density calibration against the measured pellet, and report the simulated composition, the number of seeds, and the seed-to-seed scatter.</w:t>
-      </w:r>
-    </w:p>
-    <w:p>
-      <w:pPr>
-        <w:jc w:val="both"/>
-        <w:spacing w:after="120" w:line="276" w:lineRule="auto"/>
-        <w:rPr>
-          <w:rFonts w:ascii="Times New Roman" w:eastAsia="Times New Roman" w:hAnsi="Times New Roman" w:cs="Times New Roman"/>
-          <w:sz w:val="24"/>
-          <w:szCs w:val="24"/>
-        </w:rPr>
-      </w:pPr>
-      <w:r>
-        <w:rPr>
-          <w:rFonts w:ascii="Times New Roman" w:hAnsi="Times New Roman"/>
-          <w:b w:val="0"/>
-          <w:sz w:val="24"/>
-        </w:rPr>
-        <w:t>3. The “50:50 optimal” claim is a cell-performance optimum that the present data do not establish. The conductivity-level ionic/electronic trade-off is already shown in Fig. 1 across the 50–80 vol% range; what is missing is the high-SSE performance arm, where a cell should become electron-limited. Because no cell with &gt;50 vol% SSE (≤40 vol% NCM90) was cycled, an optimum at 50:50 — as opposed to simply “more SSE is better within 50–60 vol%” — is not demonstrated. In addition, particle size and composition are varied together, so the degradation cannot be attributed uniquely to insufficient SSE coverage rather than to packing geometry. Please either cycle a &gt;50 vol% SSE cell to show the electron-limited roll-off, or restate “50:50 optimal” as “50 outperforms 60 vol% within the studied window”, and consider a control that separates coverage from packing.</w:t>
-      </w:r>
-    </w:p>
-    <w:p>
-      <w:pPr>
-        <w:jc w:val="both"/>
-        <w:spacing w:after="0" w:line="276" w:lineRule="auto"/>
-        <w:rPr>
-          <w:rFonts w:ascii="Times New Roman" w:eastAsia="Times New Roman" w:hAnsi="Times New Roman" w:cs="Times New Roman"/>
-          <w:sz w:val="24"/>
-          <w:szCs w:val="24"/>
-        </w:rPr>
-      </w:pPr>
-    </w:p>
-    <w:p>
-      <w:pPr>
-        <w:jc w:val="both"/>
-        <w:spacing w:after="120" w:line="276" w:lineRule="auto"/>
-        <w:rPr>
-          <w:rFonts w:ascii="Times New Roman" w:eastAsia="Times New Roman" w:hAnsi="Times New Roman" w:cs="Times New Roman"/>
-          <w:sz w:val="24"/>
-          <w:szCs w:val="24"/>
-        </w:rPr>
-      </w:pPr>
-      <w:r>
-        <w:rPr>
-          <w:rFonts w:ascii="Times New Roman" w:hAnsi="Times New Roman"/>
-          <w:b w:val="0"/>
-          <w:sz w:val="24"/>
-        </w:rPr>
-        <w:t>Minor comments</w:t>
-      </w:r>
-    </w:p>
-    <w:p>
-      <w:pPr>
-        <w:jc w:val="both"/>
-        <w:spacing w:after="120" w:line="276" w:lineRule="auto"/>
-        <w:rPr>
-          <w:rFonts w:ascii="Times New Roman" w:eastAsia="Times New Roman" w:hAnsi="Times New Roman" w:cs="Times New Roman"/>
-          <w:sz w:val="24"/>
-          <w:szCs w:val="24"/>
-        </w:rPr>
-      </w:pPr>
-      <w:r>
-        <w:rPr>
-          <w:rFonts w:ascii="Times New Roman" w:hAnsi="Times New Roman"/>
-          <w:b w:val="0"/>
-          <w:sz w:val="24"/>
-        </w:rPr>
-        <w:t>1. The 50 vol% capacity retention is given as “6.2%”, which contradicts Fig. 4a and the conclusion that 50 vol% performs better; this is almost certainly 96.2% and should be verified against the Fig. S2 data.</w:t>
-      </w:r>
-    </w:p>
-    <w:p>
-      <w:pPr>
-        <w:jc w:val="both"/>
-        <w:spacing w:after="120" w:line="276" w:lineRule="auto"/>
-        <w:rPr>
-          <w:rFonts w:ascii="Times New Roman" w:eastAsia="Times New Roman" w:hAnsi="Times New Roman" w:cs="Times New Roman"/>
-          <w:sz w:val="24"/>
-          <w:szCs w:val="24"/>
-        </w:rPr>
-      </w:pPr>
-      <w:r>
-        <w:rPr>
-          <w:rFonts w:ascii="Times New Roman" w:hAnsi="Times New Roman"/>
-          <w:b w:val="0"/>
-          <w:sz w:val="24"/>
-        </w:rPr>
-        <w:t>2. The simulated (as-pressed) and FIB-SEM (post-cycling) porosities are different quantities and should not be compared directly; please report the pristine FIB-SEM porosity, and state the fabrication pressures explicitly (cathode ≈240 MPa, electrolyte ≈180 MPa, stack 150 MPa).</w:t>
-      </w:r>
-    </w:p>
-    <w:p>
-      <w:pPr>
-        <w:jc w:val="both"/>
-        <w:spacing w:after="120" w:line="276" w:lineRule="auto"/>
-        <w:rPr>
-          <w:rFonts w:ascii="Times New Roman" w:eastAsia="Times New Roman" w:hAnsi="Times New Roman" w:cs="Times New Roman"/>
-          <w:sz w:val="24"/>
-          <w:szCs w:val="24"/>
-        </w:rPr>
-      </w:pPr>
-      <w:r>
-        <w:rPr>
-          <w:rFonts w:ascii="Times New Roman" w:hAnsi="Times New Roman"/>
-          <w:b w:val="0"/>
-          <w:sz w:val="24"/>
-        </w:rPr>
-        <w:t>3. “Long-term cycling” refers to only 10 cycles (Fig. S2); please relabel it or extend the test.</w:t>
-      </w:r>
-    </w:p>
-    <w:p>
-      <w:pPr>
-        <w:jc w:val="both"/>
-        <w:spacing w:after="120" w:line="276" w:lineRule="auto"/>
-        <w:rPr>
-          <w:rFonts w:ascii="Times New Roman" w:eastAsia="Times New Roman" w:hAnsi="Times New Roman" w:cs="Times New Roman"/>
-          <w:sz w:val="24"/>
-          <w:szCs w:val="24"/>
-        </w:rPr>
-      </w:pPr>
-      <w:r>
-        <w:rPr>
-          <w:rFonts w:ascii="Times New Roman" w:hAnsi="Times New Roman"/>
-          <w:b w:val="0"/>
-          <w:sz w:val="24"/>
-        </w:rPr>
-        <w:t>4. “Absence of ion-transport pathways” is too strong, since the 60 vol% cell still delivers about 167 mAh g⁻¹; “impeded” or “insufficient” would be more accurate.</w:t>
-      </w:r>
-    </w:p>
-    <w:p>
-      <w:pPr>
-        <w:jc w:val="both"/>
-        <w:spacing w:after="120" w:line="276" w:lineRule="auto"/>
-        <w:rPr>
-          <w:rFonts w:ascii="Times New Roman" w:eastAsia="Times New Roman" w:hAnsi="Times New Roman" w:cs="Times New Roman"/>
-          <w:sz w:val="24"/>
-          <w:szCs w:val="24"/>
-        </w:rPr>
-      </w:pPr>
-      <w:r>
-        <w:rPr>
-          <w:rFonts w:ascii="Times New Roman" w:hAnsi="Times New Roman"/>
-          <w:b w:val="0"/>
-          <w:sz w:val="24"/>
-        </w:rPr>
-        <w:t>5. Fig. 4c and 4e use different y-axis ranges, which understates the dQ/dV difference between the two compositions; please use a common axis, and state the voltage reference (e.g. Li-In) used for the H1-M / M-H2 / H2-H3 assignments.</w:t>
-      </w:r>
-    </w:p>
-    <w:p>
-      <w:pPr>
-        <w:jc w:val="both"/>
-        <w:spacing w:after="120" w:line="276" w:lineRule="auto"/>
-        <w:rPr>
-          <w:rFonts w:ascii="Times New Roman" w:eastAsia="Times New Roman" w:hAnsi="Times New Roman" w:cs="Times New Roman"/>
-          <w:sz w:val="24"/>
-          <w:szCs w:val="24"/>
-        </w:rPr>
-      </w:pPr>
-      <w:r>
-        <w:rPr>
-          <w:rFonts w:ascii="Times New Roman" w:hAnsi="Times New Roman"/>
-          <w:b w:val="0"/>
-          <w:sz w:val="24"/>
-        </w:rPr>
-        <w:t>6. Several values are reported to excessive precision (e.g. 43.11%, 180.12 mAh g⁻¹) without error bars or cell counts.</w:t>
-      </w:r>
-    </w:p>
-    <w:p>
-      <w:pPr>
-        <w:jc w:val="both"/>
-        <w:spacing w:after="120" w:line="276" w:lineRule="auto"/>
-        <w:rPr>
-          <w:rFonts w:ascii="Times New Roman" w:eastAsia="Times New Roman" w:hAnsi="Times New Roman" w:cs="Times New Roman"/>
-          <w:sz w:val="24"/>
-          <w:szCs w:val="24"/>
-        </w:rPr>
-      </w:pPr>
-      <w:r>
-        <w:rPr>
-          <w:rFonts w:ascii="Times New Roman" w:hAnsi="Times New Roman"/>
-          <w:b w:val="0"/>
-          <w:sz w:val="24"/>
-        </w:rPr>
-        <w:t>7. The reference markers are inconsistent: some citations appear as superscripts in the text while the reference list is numbered in brackets (for example, Minnmann et al. is reference [25]); please reconcile the two.</w:t>
-      </w:r>
-    </w:p>
-    <w:p>
-      <w:pPr>
-        <w:jc w:val="both"/>
-        <w:spacing w:after="120" w:line="276" w:lineRule="auto"/>
-        <w:rPr>
-          <w:rFonts w:ascii="Times New Roman" w:eastAsia="Times New Roman" w:hAnsi="Times New Roman" w:cs="Times New Roman"/>
-          <w:sz w:val="24"/>
-          <w:szCs w:val="24"/>
-        </w:rPr>
-      </w:pPr>
-      <w:r>
-        <w:rPr>
-          <w:rFonts w:ascii="Times New Roman" w:hAnsi="Times New Roman"/>
-          <w:b w:val="0"/>
-          <w:sz w:val="24"/>
-        </w:rPr>
-        <w:t>8. Typographical issues remain throughout: HTML apostrophe artifacts (#039;), “intrinc” → “intrinsic”, “LAMPS” → “LAMMPS”, “maintaing/remaing”, and several missing spaces after periods.</w:t>
-      </w:r>
-    </w:p>
-    <w:p>
-      <w:pPr>
-        <w:jc w:val="both"/>
-        <w:spacing w:after="120" w:line="276" w:lineRule="auto"/>
-        <w:rPr>
-          <w:rFonts w:ascii="Times New Roman" w:eastAsia="Times New Roman" w:hAnsi="Times New Roman" w:cs="Times New Roman"/>
-          <w:sz w:val="24"/>
-          <w:szCs w:val="24"/>
-        </w:rPr>
-      </w:pPr>
-      <w:r>
-        <w:rPr>
-          <w:rFonts w:ascii="Times New Roman" w:hAnsi="Times New Roman"/>
-          <w:b w:val="0"/>
-          <w:sz w:val="24"/>
-        </w:rPr>
-        <w:t>9. (Optional) Eq. (1), σ = L/(R·A), folds the tortuosity and volume fraction into R as an effective definition; stating this explicitly would help readers interpret the reported conductivities.</w:t>
-      </w:r>
-    </w:p>
-    <w:p>
-      <w:pPr>
-        <w:jc w:val="both"/>
-        <w:spacing w:after="0" w:line="276" w:lineRule="auto"/>
-        <w:rPr>
-          <w:rFonts w:ascii="Times New Roman" w:eastAsia="Times New Roman" w:hAnsi="Times New Roman" w:cs="Times New Roman"/>
-          <w:sz w:val="24"/>
-          <w:szCs w:val="24"/>
-        </w:rPr>
-      </w:pPr>
-    </w:p>
-    <w:p>
-      <w:pPr>
-        <w:jc w:val="both"/>
-        <w:spacing w:after="120" w:line="276" w:lineRule="auto"/>
-        <w:rPr>
-          <w:rFonts w:ascii="Times New Roman" w:eastAsia="Times New Roman" w:hAnsi="Times New Roman" w:cs="Times New Roman"/>
-          <w:sz w:val="24"/>
-          <w:szCs w:val="24"/>
-        </w:rPr>
-      </w:pPr>
-      <w:r>
-        <w:rPr>
-          <w:rFonts w:ascii="Times New Roman" w:hAnsi="Times New Roman"/>
-          <w:b w:val="0"/>
-          <w:sz w:val="24"/>
-        </w:rPr>
-        <w:t>Recommendation</w:t>
-      </w:r>
-    </w:p>
-    <w:p>
-      <w:pPr>
-        <w:jc w:val="both"/>
-        <w:spacing w:after="120" w:line="276" w:lineRule="auto"/>
-        <w:rPr>
-          <w:rFonts w:ascii="Times New Roman" w:eastAsia="Times New Roman" w:hAnsi="Times New Roman" w:cs="Times New Roman"/>
-          <w:sz w:val="24"/>
-          <w:szCs w:val="24"/>
-        </w:rPr>
-      </w:pPr>
-      <w:r>
-        <w:rPr>
-          <w:rFonts w:ascii="Times New Roman" w:hAnsi="Times New Roman"/>
-          <w:b w:val="0"/>
-          <w:sz w:val="24"/>
-        </w:rPr>
-        <w:t>Major revision.</w:t>
+        <w:t>Minor points: the 50 vol% retention “6.2%” contradicts Fig. 4a and the conclusion (almost certainly 96.2%); the simulated (as-pressed) and FIB-SEM (post-cycling) porosities are different quantities, and the fabrication pressures should be stated separately (cathode ≈240, electrolyte ≈180, stack 150 MPa); “long-term cycling” is only 10 cycles; “absence of ion-transport pathways” is too strong, since the 60 vol% cell still delivers ~167 mAh g⁻¹ at low rate; Fig. 4c and 4e use different y-axes; some values are over-precise (e.g. 43.11%, 180.12 mAh g⁻¹) without error bars; the in-text superscript citations do not match the bracketed reference list (Minnmann is [25]); and typos remain (#039;, “intrinc”, “LAMPS”).</w:t>
       </w:r>
     </w:p>
     <w:sectPr>
@@ -407,14 +162,53 @@
 </w:document>
 </file>
 
+<file path=word/endnotes.xml><?xml version="1.0" encoding="utf-8"?>
+<w:endnotes xmlns:wpc="http://schemas.microsoft.com/office/word/2010/wordprocessingCanvas" xmlns:cx="http://schemas.microsoft.com/office/drawing/2014/chartex" xmlns:cx1="http://schemas.microsoft.com/office/drawing/2015/9/8/chartex" xmlns:cx2="http://schemas.microsoft.com/office/drawing/2015/10/21/chartex" xmlns:cx3="http://schemas.microsoft.com/office/drawing/2016/5/9/chartex" xmlns:cx4="http://schemas.microsoft.com/office/drawing/2016/5/10/chartex" xmlns:cx5="http://schemas.microsoft.com/office/drawing/2016/5/11/chartex" xmlns:cx6="http://schemas.microsoft.com/office/drawing/2016/5/12/chartex" xmlns:cx7="http://schemas.microsoft.com/office/drawing/2016/5/13/chartex" xmlns:cx8="http://schemas.microsoft.com/office/drawing/2016/5/14/chartex" xmlns:mc="http://schemas.openxmlformats.org/markup-compatibility/2006" xmlns:aink="http://schemas.microsoft.com/office/drawing/2016/ink" xmlns:am3d="http://schemas.microsoft.com/office/drawing/2017/model3d" xmlns:o="urn:schemas-microsoft-com:office:office" xmlns:oel="http://schemas.microsoft.com/office/2019/extlst" xmlns:r="http://schemas.openxmlformats.org/officeDocument/2006/relationships" xmlns:m="http://schemas.openxmlformats.org/officeDocument/2006/math" xmlns:v="urn:schemas-microsoft-com:vml" xmlns:wp14="http://schemas.microsoft.com/office/word/2010/wordprocessingDrawing" xmlns:wp="http://schemas.openxmlformats.org/drawingml/2006/wordprocessingDrawing" xmlns:w10="urn:schemas-microsoft-com:office:word" xmlns:w="http://schemas.openxmlformats.org/wordprocessingml/2006/main" xmlns:w14="http://schemas.microsoft.com/office/word/2010/wordml" xmlns:w15="http://schemas.microsoft.com/office/word/2012/wordml" xmlns:w16cex="http://schemas.microsoft.com/office/word/2018/wordml/cex" xmlns:w16cid="http://schemas.microsoft.com/office/word/2016/wordml/cid" xmlns:w16="http://schemas.microsoft.com/office/word/2018/wordml" xmlns:w16du="http://schemas.microsoft.com/office/word/2023/wordml/word16du" xmlns:w16sdtdh="http://schemas.microsoft.com/office/word/2020/wordml/sdtdatahash" xmlns:w16sdtfl="http://schemas.microsoft.com/office/word/2024/wordml/sdtformatlock" xmlns:w16se="http://schemas.microsoft.com/office/word/2015/wordml/symex" xmlns:wpg="http://schemas.microsoft.com/office/word/2010/wordprocessingGroup" xmlns:wpi="http://schemas.microsoft.com/office/word/2010/wordprocessingInk" xmlns:wne="http://schemas.microsoft.com/office/word/2006/wordml" xmlns:wps="http://schemas.microsoft.com/office/word/2010/wordprocessingShape" mc:Ignorable="w14 w15 w16se w16cid w16 w16cex w16sdtdh w16sdtfl w16du wp14">
+  <w:endnote w:type="separator" w:id="-1">
+    <w:p>
+      <w:r>
+        <w:separator/>
+      </w:r>
+    </w:p>
+  </w:endnote>
+  <w:endnote w:type="continuationSeparator" w:id="0">
+    <w:p>
+      <w:r>
+        <w:continuationSeparator/>
+      </w:r>
+    </w:p>
+  </w:endnote>
+</w:endnotes>
+</file>
+
+<file path=word/footnotes.xml><?xml version="1.0" encoding="utf-8"?>
+<w:footnotes xmlns:wpc="http://schemas.microsoft.com/office/word/2010/wordprocessingCanvas" xmlns:cx="http://schemas.microsoft.com/office/drawing/2014/chartex" xmlns:cx1="http://schemas.microsoft.com/office/drawing/2015/9/8/chartex" xmlns:cx2="http://schemas.microsoft.com/office/drawing/2015/10/21/chartex" xmlns:cx3="http://schemas.microsoft.com/office/drawing/2016/5/9/chartex" xmlns:cx4="http://schemas.microsoft.com/office/drawing/2016/5/10/chartex" xmlns:cx5="http://schemas.microsoft.com/office/drawing/2016/5/11/chartex" xmlns:cx6="http://schemas.microsoft.com/office/drawing/2016/5/12/chartex" xmlns:cx7="http://schemas.microsoft.com/office/drawing/2016/5/13/chartex" xmlns:cx8="http://schemas.microsoft.com/office/drawing/2016/5/14/chartex" xmlns:mc="http://schemas.openxmlformats.org/markup-compatibility/2006" xmlns:aink="http://schemas.microsoft.com/office/drawing/2016/ink" xmlns:am3d="http://schemas.microsoft.com/office/drawing/2017/model3d" xmlns:o="urn:schemas-microsoft-com:office:office" xmlns:oel="http://schemas.microsoft.com/office/2019/extlst" xmlns:r="http://schemas.openxmlformats.org/officeDocument/2006/relationships" xmlns:m="http://schemas.openxmlformats.org/officeDocument/2006/math" xmlns:v="urn:schemas-microsoft-com:vml" xmlns:wp14="http://schemas.microsoft.com/office/word/2010/wordprocessingDrawing" xmlns:wp="http://schemas.openxmlformats.org/drawingml/2006/wordprocessingDrawing" xmlns:w10="urn:schemas-microsoft-com:office:word" xmlns:w="http://schemas.openxmlformats.org/wordprocessingml/2006/main" xmlns:w14="http://schemas.microsoft.com/office/word/2010/wordml" xmlns:w15="http://schemas.microsoft.com/office/word/2012/wordml" xmlns:w16cex="http://schemas.microsoft.com/office/word/2018/wordml/cex" xmlns:w16cid="http://schemas.microsoft.com/office/word/2016/wordml/cid" xmlns:w16="http://schemas.microsoft.com/office/word/2018/wordml" xmlns:w16du="http://schemas.microsoft.com/office/word/2023/wordml/word16du" xmlns:w16sdtdh="http://schemas.microsoft.com/office/word/2020/wordml/sdtdatahash" xmlns:w16sdtfl="http://schemas.microsoft.com/office/word/2024/wordml/sdtformatlock" xmlns:w16se="http://schemas.microsoft.com/office/word/2015/wordml/symex" xmlns:wpg="http://schemas.microsoft.com/office/word/2010/wordprocessingGroup" xmlns:wpi="http://schemas.microsoft.com/office/word/2010/wordprocessingInk" xmlns:wne="http://schemas.microsoft.com/office/word/2006/wordml" xmlns:wps="http://schemas.microsoft.com/office/word/2010/wordprocessingShape" mc:Ignorable="w14 w15 w16se w16cid w16 w16cex w16sdtdh w16sdtfl w16du wp14">
+  <w:footnote w:type="separator" w:id="-1">
+    <w:p>
+      <w:r>
+        <w:separator/>
+      </w:r>
+    </w:p>
+  </w:footnote>
+  <w:footnote w:type="continuationSeparator" w:id="0">
+    <w:p>
+      <w:r>
+        <w:continuationSeparator/>
+      </w:r>
+    </w:p>
+  </w:footnote>
+</w:footnotes>
+</file>
+
 <file path=word/numbering.xml><?xml version="1.0" encoding="utf-8"?>
-<w:numbering xmlns:ve="http://schemas.openxmlformats.org/markup-compatibility/2006" xmlns:o="urn:schemas-microsoft-com:office:office" xmlns:r="http://schemas.openxmlformats.org/officeDocument/2006/relationships" xmlns:m="http://schemas.openxmlformats.org/officeDocument/2006/math" xmlns:v="urn:schemas-microsoft-com:vml" xmlns:wp="http://schemas.openxmlformats.org/drawingml/2006/wordprocessingDrawing" xmlns:w10="urn:schemas-microsoft-com:office:word" xmlns:w="http://schemas.openxmlformats.org/wordprocessingml/2006/main" xmlns:w14="http://schemas.microsoft.com/office/word/2010/wordml" xmlns:wne="http://schemas.microsoft.com/office/word/2006/wordml">
-  <w:abstractNum w:abstractNumId="0">
-    <w:nsid w:val="1fc0529b"/>
+<w:numbering xmlns:wpc="http://schemas.microsoft.com/office/word/2010/wordprocessingCanvas" xmlns:cx="http://schemas.microsoft.com/office/drawing/2014/chartex" xmlns:cx1="http://schemas.microsoft.com/office/drawing/2015/9/8/chartex" xmlns:cx2="http://schemas.microsoft.com/office/drawing/2015/10/21/chartex" xmlns:cx3="http://schemas.microsoft.com/office/drawing/2016/5/9/chartex" xmlns:cx4="http://schemas.microsoft.com/office/drawing/2016/5/10/chartex" xmlns:cx5="http://schemas.microsoft.com/office/drawing/2016/5/11/chartex" xmlns:cx6="http://schemas.microsoft.com/office/drawing/2016/5/12/chartex" xmlns:cx7="http://schemas.microsoft.com/office/drawing/2016/5/13/chartex" xmlns:cx8="http://schemas.microsoft.com/office/drawing/2016/5/14/chartex" xmlns:mc="http://schemas.openxmlformats.org/markup-compatibility/2006" xmlns:aink="http://schemas.microsoft.com/office/drawing/2016/ink" xmlns:am3d="http://schemas.microsoft.com/office/drawing/2017/model3d" xmlns:o="urn:schemas-microsoft-com:office:office" xmlns:oel="http://schemas.microsoft.com/office/2019/extlst" xmlns:r="http://schemas.openxmlformats.org/officeDocument/2006/relationships" xmlns:m="http://schemas.openxmlformats.org/officeDocument/2006/math" xmlns:v="urn:schemas-microsoft-com:vml" xmlns:wp14="http://schemas.microsoft.com/office/word/2010/wordprocessingDrawing" xmlns:wp="http://schemas.openxmlformats.org/drawingml/2006/wordprocessingDrawing" xmlns:w10="urn:schemas-microsoft-com:office:word" xmlns:w="http://schemas.openxmlformats.org/wordprocessingml/2006/main" xmlns:w14="http://schemas.microsoft.com/office/word/2010/wordml" xmlns:w15="http://schemas.microsoft.com/office/word/2012/wordml" xmlns:w16cex="http://schemas.microsoft.com/office/word/2018/wordml/cex" xmlns:w16cid="http://schemas.microsoft.com/office/word/2016/wordml/cid" xmlns:w16="http://schemas.microsoft.com/office/word/2018/wordml" xmlns:w16du="http://schemas.microsoft.com/office/word/2023/wordml/word16du" xmlns:w16sdtdh="http://schemas.microsoft.com/office/word/2020/wordml/sdtdatahash" xmlns:w16sdtfl="http://schemas.microsoft.com/office/word/2024/wordml/sdtformatlock" xmlns:w16se="http://schemas.microsoft.com/office/word/2015/wordml/symex" xmlns:wpg="http://schemas.microsoft.com/office/word/2010/wordprocessingGroup" xmlns:wpi="http://schemas.microsoft.com/office/word/2010/wordprocessingInk" xmlns:wne="http://schemas.microsoft.com/office/word/2006/wordml" xmlns:wps="http://schemas.microsoft.com/office/word/2010/wordprocessingShape" mc:Ignorable="w14 w15 w16se w16cid w16 w16cex w16sdtdh w16sdtfl w16du wp14">
+  <w:abstractNum w:abstractNumId="0" w15:restartNumberingAfterBreak="0">
+    <w:nsid w:val="1FC0529B"/>
     <w:multiLevelType w:val="hybridMultilevel"/>
-    <w:tmpl w:val="b5668674"/>
-    <w:lvl w:ilvl="0" w:tplc="350c9eee">
+    <w:tmpl w:val="B5668674"/>
+    <w:lvl w:ilvl="0" w:tplc="350C9EEE">
       <w:start w:val="1"/>
+      <w:numFmt w:val="decimal"/>
       <w:lvlText w:val="%1."/>
       <w:lvlJc w:val="left"/>
       <w:pPr>
@@ -425,7 +219,7 @@
         <w:b/>
       </w:rPr>
     </w:lvl>
-    <w:lvl w:ilvl="1" w:tentative="on" w:tplc="4090019">
+    <w:lvl w:ilvl="1" w:tplc="04090019" w:tentative="1">
       <w:start w:val="1"/>
       <w:numFmt w:val="upperLetter"/>
       <w:lvlText w:val="%2."/>
@@ -434,7 +228,7 @@
         <w:ind w:left="1320" w:hanging="440"/>
       </w:pPr>
     </w:lvl>
-    <w:lvl w:ilvl="2" w:tentative="on" w:tplc="409001b">
+    <w:lvl w:ilvl="2" w:tplc="0409001B" w:tentative="1">
       <w:start w:val="1"/>
       <w:numFmt w:val="lowerRoman"/>
       <w:lvlText w:val="%3."/>
@@ -443,15 +237,16 @@
         <w:ind w:left="1760" w:hanging="440"/>
       </w:pPr>
     </w:lvl>
-    <w:lvl w:ilvl="3" w:tentative="on" w:tplc="409000f">
+    <w:lvl w:ilvl="3" w:tplc="0409000F" w:tentative="1">
       <w:start w:val="1"/>
+      <w:numFmt w:val="decimal"/>
       <w:lvlText w:val="%4."/>
       <w:lvlJc w:val="left"/>
       <w:pPr>
         <w:ind w:left="2200" w:hanging="440"/>
       </w:pPr>
     </w:lvl>
-    <w:lvl w:ilvl="4" w:tentative="on" w:tplc="4090019">
+    <w:lvl w:ilvl="4" w:tplc="04090019" w:tentative="1">
       <w:start w:val="1"/>
       <w:numFmt w:val="upperLetter"/>
       <w:lvlText w:val="%5."/>
@@ -460,7 +255,7 @@
         <w:ind w:left="2640" w:hanging="440"/>
       </w:pPr>
     </w:lvl>
-    <w:lvl w:ilvl="5" w:tentative="on" w:tplc="409001b">
+    <w:lvl w:ilvl="5" w:tplc="0409001B" w:tentative="1">
       <w:start w:val="1"/>
       <w:numFmt w:val="lowerRoman"/>
       <w:lvlText w:val="%6."/>
@@ -469,15 +264,16 @@
         <w:ind w:left="3080" w:hanging="440"/>
       </w:pPr>
     </w:lvl>
-    <w:lvl w:ilvl="6" w:tentative="on" w:tplc="409000f">
+    <w:lvl w:ilvl="6" w:tplc="0409000F" w:tentative="1">
       <w:start w:val="1"/>
+      <w:numFmt w:val="decimal"/>
       <w:lvlText w:val="%7."/>
       <w:lvlJc w:val="left"/>
       <w:pPr>
         <w:ind w:left="3520" w:hanging="440"/>
       </w:pPr>
     </w:lvl>
-    <w:lvl w:ilvl="7" w:tentative="on" w:tplc="4090019">
+    <w:lvl w:ilvl="7" w:tplc="04090019" w:tentative="1">
       <w:start w:val="1"/>
       <w:numFmt w:val="upperLetter"/>
       <w:lvlText w:val="%8."/>
@@ -486,7 +282,7 @@
         <w:ind w:left="3960" w:hanging="440"/>
       </w:pPr>
     </w:lvl>
-    <w:lvl w:ilvl="8" w:tentative="on" w:tplc="409001b">
+    <w:lvl w:ilvl="8" w:tplc="0409001B" w:tentative="1">
       <w:start w:val="1"/>
       <w:numFmt w:val="lowerRoman"/>
       <w:lvlText w:val="%9."/>
@@ -496,24 +292,22 @@
       </w:pPr>
     </w:lvl>
   </w:abstractNum>
-  <w:num w:numId="1">
+  <w:num w:numId="1" w16cid:durableId="166331412">
     <w:abstractNumId w:val="0"/>
   </w:num>
 </w:numbering>
 </file>
 
 <file path=word/styles.xml><?xml version="1.0" encoding="utf-8"?>
-<w:styles xmlns:r="http://schemas.openxmlformats.org/officeDocument/2006/relationships" xmlns:w="http://schemas.openxmlformats.org/wordprocessingml/2006/main">
+<w:styles xmlns:mc="http://schemas.openxmlformats.org/markup-compatibility/2006" xmlns:r="http://schemas.openxmlformats.org/officeDocument/2006/relationships" xmlns:w="http://schemas.openxmlformats.org/wordprocessingml/2006/main" xmlns:w14="http://schemas.microsoft.com/office/word/2010/wordml" xmlns:w15="http://schemas.microsoft.com/office/word/2012/wordml" xmlns:w16cex="http://schemas.microsoft.com/office/word/2018/wordml/cex" xmlns:w16cid="http://schemas.microsoft.com/office/word/2016/wordml/cid" xmlns:w16="http://schemas.microsoft.com/office/word/2018/wordml" xmlns:w16du="http://schemas.microsoft.com/office/word/2023/wordml/word16du" xmlns:w16sdtdh="http://schemas.microsoft.com/office/word/2020/wordml/sdtdatahash" xmlns:w16sdtfl="http://schemas.microsoft.com/office/word/2024/wordml/sdtformatlock" xmlns:w16se="http://schemas.microsoft.com/office/word/2015/wordml/symex" mc:Ignorable="w14 w15 w16se w16cid w16 w16cex w16sdtdh w16sdtfl w16du">
   <w:docDefaults>
     <w:rPrDefault>
       <w:rPr>
+        <w:rFonts w:ascii="Arial" w:eastAsia="맑은 고딕" w:hAnsi="Arial" w:cs="Arial"/>
         <w:lang w:val="en-US" w:eastAsia="ko-KR" w:bidi="ar-SA"/>
-        <w:rFonts w:ascii="Arial" w:eastAsia="맑은 고딕" w:hAnsi="Arial" w:cs="Arial"/>
       </w:rPr>
     </w:rPrDefault>
-    <w:pPrDefault>
-      <w:pPr/>
-    </w:pPrDefault>
+    <w:pPrDefault/>
   </w:docDefaults>
   <w:latentStyles w:defLockedState="0" w:defUIPriority="0" w:defSemiHidden="0" w:defUnhideWhenUsed="0" w:defQFormat="0" w:count="376">
     <w:lsdException w:name="Normal" w:qFormat="1"/>
@@ -526,153 +320,153 @@
     <w:lsdException w:name="heading 7" w:semiHidden="1" w:uiPriority="9" w:unhideWhenUsed="1" w:qFormat="1"/>
     <w:lsdException w:name="heading 8" w:semiHidden="1" w:uiPriority="9" w:unhideWhenUsed="1" w:qFormat="1"/>
     <w:lsdException w:name="heading 9" w:semiHidden="1" w:uiPriority="9" w:unhideWhenUsed="1" w:qFormat="1"/>
-    <w:lsdException w:name="index 1" w:semiHidden="1" w:uiPriority="153" w:unhideWhenUsed="1"/>
-    <w:lsdException w:name="index 2" w:semiHidden="1" w:uiPriority="153" w:unhideWhenUsed="1"/>
-    <w:lsdException w:name="index 3" w:semiHidden="1" w:uiPriority="153" w:unhideWhenUsed="1"/>
-    <w:lsdException w:name="index 4" w:semiHidden="1" w:uiPriority="153" w:unhideWhenUsed="1"/>
-    <w:lsdException w:name="index 5" w:semiHidden="1" w:uiPriority="153" w:unhideWhenUsed="1"/>
-    <w:lsdException w:name="index 6" w:semiHidden="1" w:uiPriority="153" w:unhideWhenUsed="1"/>
-    <w:lsdException w:name="index 7" w:semiHidden="1" w:uiPriority="153" w:unhideWhenUsed="1"/>
-    <w:lsdException w:name="index 8" w:semiHidden="1" w:uiPriority="153" w:unhideWhenUsed="1"/>
-    <w:lsdException w:name="index 9" w:semiHidden="1" w:uiPriority="153" w:unhideWhenUsed="1"/>
-    <w:lsdException w:name="toc 1" w:semiHidden="1" w:uiPriority="135" w:unhideWhenUsed="1"/>
-    <w:lsdException w:name="toc 2" w:semiHidden="1" w:uiPriority="135" w:unhideWhenUsed="1"/>
-    <w:lsdException w:name="toc 3" w:semiHidden="1" w:uiPriority="135" w:unhideWhenUsed="1"/>
-    <w:lsdException w:name="toc 4" w:semiHidden="1" w:uiPriority="135" w:unhideWhenUsed="1"/>
-    <w:lsdException w:name="toc 5" w:semiHidden="1" w:uiPriority="135" w:unhideWhenUsed="1"/>
-    <w:lsdException w:name="toc 6" w:semiHidden="1" w:uiPriority="135" w:unhideWhenUsed="1"/>
-    <w:lsdException w:name="toc 7" w:semiHidden="1" w:uiPriority="135" w:unhideWhenUsed="1"/>
-    <w:lsdException w:name="toc 8" w:semiHidden="1" w:uiPriority="135" w:unhideWhenUsed="1"/>
-    <w:lsdException w:name="toc 9" w:semiHidden="1" w:uiPriority="135" w:unhideWhenUsed="1"/>
-    <w:lsdException w:name="Normal Indent" w:semiHidden="1" w:uiPriority="153" w:unhideWhenUsed="1"/>
-    <w:lsdException w:name="footnote text" w:semiHidden="1" w:uiPriority="153" w:unhideWhenUsed="1"/>
-    <w:lsdException w:name="annotation text" w:semiHidden="1" w:uiPriority="153" w:unhideWhenUsed="1"/>
-    <w:lsdException w:name="header" w:semiHidden="1" w:uiPriority="153" w:unhideWhenUsed="1"/>
-    <w:lsdException w:name="footer" w:semiHidden="1" w:uiPriority="153" w:unhideWhenUsed="1"/>
-    <w:lsdException w:name="index heading" w:semiHidden="1" w:uiPriority="153" w:unhideWhenUsed="1"/>
-    <w:lsdException w:name="caption" w:semiHidden="1" w:uiPriority="131" w:unhideWhenUsed="1" w:qFormat="1"/>
-    <w:lsdException w:name="table of figures" w:semiHidden="1" w:uiPriority="153" w:unhideWhenUsed="1"/>
-    <w:lsdException w:name="envelope address" w:semiHidden="1" w:uiPriority="153" w:unhideWhenUsed="1"/>
-    <w:lsdException w:name="envelope return" w:semiHidden="1" w:uiPriority="153" w:unhideWhenUsed="1"/>
-    <w:lsdException w:name="footnote reference" w:semiHidden="1" w:uiPriority="153" w:unhideWhenUsed="1"/>
-    <w:lsdException w:name="annotation reference" w:semiHidden="1" w:uiPriority="153" w:unhideWhenUsed="1"/>
-    <w:lsdException w:name="line number" w:semiHidden="1" w:uiPriority="153" w:unhideWhenUsed="1"/>
-    <w:lsdException w:name="page number" w:semiHidden="1" w:uiPriority="153" w:unhideWhenUsed="1"/>
-    <w:lsdException w:name="endnote reference" w:semiHidden="1" w:uiPriority="153" w:unhideWhenUsed="1"/>
-    <w:lsdException w:name="endnote text" w:semiHidden="1" w:uiPriority="153" w:unhideWhenUsed="1"/>
-    <w:lsdException w:name="table of authorities" w:semiHidden="1" w:uiPriority="153" w:unhideWhenUsed="1"/>
-    <w:lsdException w:name="macro" w:semiHidden="1" w:uiPriority="153" w:unhideWhenUsed="1"/>
-    <w:lsdException w:name="toa heading" w:semiHidden="1" w:uiPriority="153" w:unhideWhenUsed="1"/>
-    <w:lsdException w:name="List" w:semiHidden="1" w:uiPriority="153" w:unhideWhenUsed="1"/>
-    <w:lsdException w:name="List Bullet" w:semiHidden="1" w:uiPriority="153" w:unhideWhenUsed="1"/>
-    <w:lsdException w:name="List Number" w:semiHidden="1" w:uiPriority="153" w:unhideWhenUsed="1"/>
-    <w:lsdException w:name="List 2" w:semiHidden="1" w:uiPriority="153" w:unhideWhenUsed="1"/>
-    <w:lsdException w:name="List 3" w:semiHidden="1" w:uiPriority="153" w:unhideWhenUsed="1"/>
-    <w:lsdException w:name="List 4" w:semiHidden="1" w:uiPriority="153" w:unhideWhenUsed="1"/>
-    <w:lsdException w:name="List 5" w:semiHidden="1" w:uiPriority="153" w:unhideWhenUsed="1"/>
-    <w:lsdException w:name="List Bullet 2" w:semiHidden="1" w:uiPriority="153" w:unhideWhenUsed="1"/>
-    <w:lsdException w:name="List Bullet 3" w:semiHidden="1" w:uiPriority="153" w:unhideWhenUsed="1"/>
-    <w:lsdException w:name="List Bullet 4" w:semiHidden="1" w:uiPriority="153" w:unhideWhenUsed="1"/>
-    <w:lsdException w:name="List Bullet 5" w:semiHidden="1" w:uiPriority="153" w:unhideWhenUsed="1"/>
-    <w:lsdException w:name="List Number 2" w:semiHidden="1" w:uiPriority="153" w:unhideWhenUsed="1"/>
-    <w:lsdException w:name="List Number 3" w:semiHidden="1" w:uiPriority="153" w:unhideWhenUsed="1"/>
-    <w:lsdException w:name="List Number 4" w:semiHidden="1" w:uiPriority="153" w:unhideWhenUsed="1"/>
-    <w:lsdException w:name="List Number 5" w:semiHidden="1" w:uiPriority="153" w:unhideWhenUsed="1"/>
-    <w:lsdException w:name="Title" w:uiPriority="34" w:qFormat="1"/>
-    <w:lsdException w:name="Closing" w:semiHidden="1" w:uiPriority="153" w:unhideWhenUsed="1"/>
-    <w:lsdException w:name="Signature" w:semiHidden="1" w:uiPriority="153" w:unhideWhenUsed="1"/>
+    <w:lsdException w:name="index 1" w:semiHidden="1" w:uiPriority="99" w:unhideWhenUsed="1"/>
+    <w:lsdException w:name="index 2" w:semiHidden="1" w:uiPriority="99" w:unhideWhenUsed="1"/>
+    <w:lsdException w:name="index 3" w:semiHidden="1" w:uiPriority="99" w:unhideWhenUsed="1"/>
+    <w:lsdException w:name="index 4" w:semiHidden="1" w:uiPriority="99" w:unhideWhenUsed="1"/>
+    <w:lsdException w:name="index 5" w:semiHidden="1" w:uiPriority="99" w:unhideWhenUsed="1"/>
+    <w:lsdException w:name="index 6" w:semiHidden="1" w:uiPriority="99" w:unhideWhenUsed="1"/>
+    <w:lsdException w:name="index 7" w:semiHidden="1" w:uiPriority="99" w:unhideWhenUsed="1"/>
+    <w:lsdException w:name="index 8" w:semiHidden="1" w:uiPriority="99" w:unhideWhenUsed="1"/>
+    <w:lsdException w:name="index 9" w:semiHidden="1" w:uiPriority="99" w:unhideWhenUsed="1"/>
+    <w:lsdException w:name="toc 1" w:semiHidden="1" w:uiPriority="87" w:unhideWhenUsed="1"/>
+    <w:lsdException w:name="toc 2" w:semiHidden="1" w:uiPriority="87" w:unhideWhenUsed="1"/>
+    <w:lsdException w:name="toc 3" w:semiHidden="1" w:uiPriority="87" w:unhideWhenUsed="1"/>
+    <w:lsdException w:name="toc 4" w:semiHidden="1" w:uiPriority="87" w:unhideWhenUsed="1"/>
+    <w:lsdException w:name="toc 5" w:semiHidden="1" w:uiPriority="87" w:unhideWhenUsed="1"/>
+    <w:lsdException w:name="toc 6" w:semiHidden="1" w:uiPriority="87" w:unhideWhenUsed="1"/>
+    <w:lsdException w:name="toc 7" w:semiHidden="1" w:uiPriority="87" w:unhideWhenUsed="1"/>
+    <w:lsdException w:name="toc 8" w:semiHidden="1" w:uiPriority="87" w:unhideWhenUsed="1"/>
+    <w:lsdException w:name="toc 9" w:semiHidden="1" w:uiPriority="87" w:unhideWhenUsed="1"/>
+    <w:lsdException w:name="Normal Indent" w:semiHidden="1" w:uiPriority="99" w:unhideWhenUsed="1"/>
+    <w:lsdException w:name="footnote text" w:semiHidden="1" w:uiPriority="99" w:unhideWhenUsed="1"/>
+    <w:lsdException w:name="annotation text" w:semiHidden="1" w:uiPriority="99" w:unhideWhenUsed="1"/>
+    <w:lsdException w:name="header" w:semiHidden="1" w:uiPriority="99" w:unhideWhenUsed="1"/>
+    <w:lsdException w:name="footer" w:semiHidden="1" w:uiPriority="99" w:unhideWhenUsed="1"/>
+    <w:lsdException w:name="index heading" w:semiHidden="1" w:uiPriority="99" w:unhideWhenUsed="1"/>
+    <w:lsdException w:name="caption" w:semiHidden="1" w:uiPriority="83" w:unhideWhenUsed="1" w:qFormat="1"/>
+    <w:lsdException w:name="table of figures" w:semiHidden="1" w:uiPriority="99" w:unhideWhenUsed="1"/>
+    <w:lsdException w:name="envelope address" w:semiHidden="1" w:uiPriority="99" w:unhideWhenUsed="1"/>
+    <w:lsdException w:name="envelope return" w:semiHidden="1" w:uiPriority="99" w:unhideWhenUsed="1"/>
+    <w:lsdException w:name="footnote reference" w:semiHidden="1" w:uiPriority="99" w:unhideWhenUsed="1"/>
+    <w:lsdException w:name="annotation reference" w:semiHidden="1" w:uiPriority="99" w:unhideWhenUsed="1"/>
+    <w:lsdException w:name="line number" w:semiHidden="1" w:uiPriority="99" w:unhideWhenUsed="1"/>
+    <w:lsdException w:name="page number" w:semiHidden="1" w:uiPriority="99" w:unhideWhenUsed="1"/>
+    <w:lsdException w:name="endnote reference" w:semiHidden="1" w:uiPriority="99" w:unhideWhenUsed="1"/>
+    <w:lsdException w:name="endnote text" w:semiHidden="1" w:uiPriority="99" w:unhideWhenUsed="1"/>
+    <w:lsdException w:name="table of authorities" w:semiHidden="1" w:uiPriority="99" w:unhideWhenUsed="1"/>
+    <w:lsdException w:name="macro" w:semiHidden="1" w:uiPriority="99" w:unhideWhenUsed="1"/>
+    <w:lsdException w:name="toa heading" w:semiHidden="1" w:uiPriority="99" w:unhideWhenUsed="1"/>
+    <w:lsdException w:name="List" w:semiHidden="1" w:uiPriority="99" w:unhideWhenUsed="1"/>
+    <w:lsdException w:name="List Bullet" w:semiHidden="1" w:uiPriority="99" w:unhideWhenUsed="1"/>
+    <w:lsdException w:name="List Number" w:semiHidden="1" w:uiPriority="99" w:unhideWhenUsed="1"/>
+    <w:lsdException w:name="List 2" w:semiHidden="1" w:uiPriority="99" w:unhideWhenUsed="1"/>
+    <w:lsdException w:name="List 3" w:semiHidden="1" w:uiPriority="99" w:unhideWhenUsed="1"/>
+    <w:lsdException w:name="List 4" w:semiHidden="1" w:uiPriority="99" w:unhideWhenUsed="1"/>
+    <w:lsdException w:name="List 5" w:semiHidden="1" w:uiPriority="99" w:unhideWhenUsed="1"/>
+    <w:lsdException w:name="List Bullet 2" w:semiHidden="1" w:uiPriority="99" w:unhideWhenUsed="1"/>
+    <w:lsdException w:name="List Bullet 3" w:semiHidden="1" w:uiPriority="99" w:unhideWhenUsed="1"/>
+    <w:lsdException w:name="List Bullet 4" w:semiHidden="1" w:uiPriority="99" w:unhideWhenUsed="1"/>
+    <w:lsdException w:name="List Bullet 5" w:semiHidden="1" w:uiPriority="99" w:unhideWhenUsed="1"/>
+    <w:lsdException w:name="List Number 2" w:semiHidden="1" w:uiPriority="99" w:unhideWhenUsed="1"/>
+    <w:lsdException w:name="List Number 3" w:semiHidden="1" w:uiPriority="99" w:unhideWhenUsed="1"/>
+    <w:lsdException w:name="List Number 4" w:semiHidden="1" w:uiPriority="99" w:unhideWhenUsed="1"/>
+    <w:lsdException w:name="List Number 5" w:semiHidden="1" w:uiPriority="99" w:unhideWhenUsed="1"/>
+    <w:lsdException w:name="Title" w:uiPriority="22" w:qFormat="1"/>
+    <w:lsdException w:name="Closing" w:semiHidden="1" w:uiPriority="99" w:unhideWhenUsed="1"/>
+    <w:lsdException w:name="Signature" w:semiHidden="1" w:uiPriority="99" w:unhideWhenUsed="1"/>
     <w:lsdException w:name="Default Paragraph Font" w:semiHidden="1" w:uiPriority="1" w:unhideWhenUsed="1"/>
-    <w:lsdException w:name="Body Text" w:semiHidden="1" w:uiPriority="153" w:unhideWhenUsed="1"/>
-    <w:lsdException w:name="Body Text Indent" w:semiHidden="1" w:uiPriority="153" w:unhideWhenUsed="1"/>
-    <w:lsdException w:name="List Continue" w:semiHidden="1" w:uiPriority="153" w:unhideWhenUsed="1"/>
-    <w:lsdException w:name="List Continue 2" w:semiHidden="1" w:uiPriority="153" w:unhideWhenUsed="1"/>
-    <w:lsdException w:name="List Continue 3" w:semiHidden="1" w:uiPriority="153" w:unhideWhenUsed="1"/>
-    <w:lsdException w:name="List Continue 4" w:semiHidden="1" w:uiPriority="153" w:unhideWhenUsed="1"/>
-    <w:lsdException w:name="List Continue 5" w:semiHidden="1" w:uiPriority="153" w:unhideWhenUsed="1"/>
-    <w:lsdException w:name="Message Header" w:semiHidden="1" w:uiPriority="153" w:unhideWhenUsed="1"/>
-    <w:lsdException w:name="Subtitle" w:uiPriority="35" w:qFormat="1"/>
-    <w:lsdException w:name="Salutation" w:semiHidden="1" w:uiPriority="153" w:unhideWhenUsed="1"/>
-    <w:lsdException w:name="Date" w:semiHidden="1" w:uiPriority="153" w:unhideWhenUsed="1"/>
-    <w:lsdException w:name="Body Text First Indent" w:semiHidden="1" w:uiPriority="153" w:unhideWhenUsed="1"/>
-    <w:lsdException w:name="Body Text First Indent 2" w:semiHidden="1" w:uiPriority="153" w:unhideWhenUsed="1"/>
-    <w:lsdException w:name="Note Heading" w:semiHidden="1" w:uiPriority="153" w:unhideWhenUsed="1"/>
-    <w:lsdException w:name="Body Text 2" w:semiHidden="1" w:uiPriority="153" w:unhideWhenUsed="1"/>
-    <w:lsdException w:name="Body Text 3" w:semiHidden="1" w:uiPriority="153" w:unhideWhenUsed="1"/>
-    <w:lsdException w:name="Body Text Indent 2" w:semiHidden="1" w:uiPriority="153" w:unhideWhenUsed="1"/>
-    <w:lsdException w:name="Body Text Indent 3" w:semiHidden="1" w:uiPriority="153" w:unhideWhenUsed="1"/>
-    <w:lsdException w:name="Block Text" w:semiHidden="1" w:uiPriority="153" w:unhideWhenUsed="1"/>
-    <w:lsdException w:name="Hyperlink" w:semiHidden="1" w:uiPriority="153" w:unhideWhenUsed="1"/>
-    <w:lsdException w:name="FollowedHyperlink" w:semiHidden="1" w:uiPriority="153" w:unhideWhenUsed="1"/>
-    <w:lsdException w:name="Strong" w:uiPriority="82" w:qFormat="1"/>
-    <w:lsdException w:name="Emphasis" w:uiPriority="80" w:qFormat="1"/>
-    <w:lsdException w:name="Document Map" w:semiHidden="1" w:uiPriority="153" w:unhideWhenUsed="1"/>
-    <w:lsdException w:name="Plain Text" w:semiHidden="1" w:uiPriority="153" w:unhideWhenUsed="1"/>
-    <w:lsdException w:name="E-mail Signature" w:semiHidden="1" w:uiPriority="153" w:unhideWhenUsed="1"/>
-    <w:lsdException w:name="HTML Top of Form" w:semiHidden="1" w:uiPriority="153" w:unhideWhenUsed="1"/>
-    <w:lsdException w:name="HTML Bottom of Form" w:semiHidden="1" w:uiPriority="153" w:unhideWhenUsed="1"/>
-    <w:lsdException w:name="Normal (Web)" w:semiHidden="1" w:uiPriority="153" w:unhideWhenUsed="1"/>
-    <w:lsdException w:name="HTML Acronym" w:semiHidden="1" w:uiPriority="153" w:unhideWhenUsed="1"/>
-    <w:lsdException w:name="HTML Address" w:semiHidden="1" w:uiPriority="153" w:unhideWhenUsed="1"/>
-    <w:lsdException w:name="HTML Cite" w:semiHidden="1" w:uiPriority="153" w:unhideWhenUsed="1"/>
-    <w:lsdException w:name="HTML Code" w:semiHidden="1" w:uiPriority="153" w:unhideWhenUsed="1"/>
-    <w:lsdException w:name="HTML Definition" w:semiHidden="1" w:uiPriority="153" w:unhideWhenUsed="1"/>
-    <w:lsdException w:name="HTML Keyboard" w:semiHidden="1" w:uiPriority="153" w:unhideWhenUsed="1"/>
-    <w:lsdException w:name="HTML Preformatted" w:semiHidden="1" w:uiPriority="153" w:unhideWhenUsed="1"/>
-    <w:lsdException w:name="HTML Sample" w:semiHidden="1" w:uiPriority="153" w:unhideWhenUsed="1"/>
-    <w:lsdException w:name="HTML Typewriter" w:semiHidden="1" w:uiPriority="153" w:unhideWhenUsed="1"/>
-    <w:lsdException w:name="HTML Variable" w:semiHidden="1" w:uiPriority="153" w:unhideWhenUsed="1"/>
-    <w:lsdException w:name="Normal Table" w:semiHidden="1" w:uiPriority="153" w:unhideWhenUsed="1"/>
-    <w:lsdException w:name="annotation subject" w:semiHidden="1" w:uiPriority="153" w:unhideWhenUsed="1"/>
-    <w:lsdException w:name="No List" w:semiHidden="1" w:uiPriority="153" w:unhideWhenUsed="1"/>
-    <w:lsdException w:name="Outline List 1" w:semiHidden="1" w:uiPriority="153" w:unhideWhenUsed="1"/>
-    <w:lsdException w:name="Outline List 2" w:semiHidden="1" w:uiPriority="153" w:unhideWhenUsed="1"/>
-    <w:lsdException w:name="Outline List 3" w:semiHidden="1" w:uiPriority="153" w:unhideWhenUsed="1"/>
-    <w:lsdException w:name="Table Simple 1" w:semiHidden="1" w:uiPriority="153" w:unhideWhenUsed="1"/>
-    <w:lsdException w:name="Table Simple 2" w:semiHidden="1" w:uiPriority="153" w:unhideWhenUsed="1"/>
-    <w:lsdException w:name="Table Simple 3" w:semiHidden="1" w:uiPriority="153" w:unhideWhenUsed="1"/>
-    <w:lsdException w:name="Table Classic 1" w:semiHidden="1" w:uiPriority="153" w:unhideWhenUsed="1"/>
-    <w:lsdException w:name="Table Classic 2" w:semiHidden="1" w:uiPriority="153" w:unhideWhenUsed="1"/>
-    <w:lsdException w:name="Table Classic 3" w:semiHidden="1" w:uiPriority="153" w:unhideWhenUsed="1"/>
-    <w:lsdException w:name="Table Classic 4" w:semiHidden="1" w:uiPriority="153" w:unhideWhenUsed="1"/>
-    <w:lsdException w:name="Table Colorful 1" w:semiHidden="1" w:uiPriority="153" w:unhideWhenUsed="1"/>
-    <w:lsdException w:name="Table Colorful 2" w:semiHidden="1" w:uiPriority="153" w:unhideWhenUsed="1"/>
-    <w:lsdException w:name="Table Colorful 3" w:semiHidden="1" w:uiPriority="153" w:unhideWhenUsed="1"/>
-    <w:lsdException w:name="Table Columns 1" w:semiHidden="1" w:uiPriority="153" w:unhideWhenUsed="1"/>
-    <w:lsdException w:name="Table Columns 2" w:semiHidden="1" w:uiPriority="153" w:unhideWhenUsed="1"/>
-    <w:lsdException w:name="Table Columns 3" w:semiHidden="1" w:uiPriority="153" w:unhideWhenUsed="1"/>
-    <w:lsdException w:name="Table Columns 4" w:semiHidden="1" w:uiPriority="153" w:unhideWhenUsed="1"/>
-    <w:lsdException w:name="Table Columns 5" w:semiHidden="1" w:uiPriority="153" w:unhideWhenUsed="1"/>
-    <w:lsdException w:name="Table Grid 1" w:semiHidden="1" w:uiPriority="153" w:unhideWhenUsed="1"/>
-    <w:lsdException w:name="Table Grid 2" w:semiHidden="1" w:uiPriority="153" w:unhideWhenUsed="1"/>
-    <w:lsdException w:name="Table Grid 3" w:semiHidden="1" w:uiPriority="153" w:unhideWhenUsed="1"/>
-    <w:lsdException w:name="Table Grid 4" w:semiHidden="1" w:uiPriority="153" w:unhideWhenUsed="1"/>
-    <w:lsdException w:name="Table Grid 5" w:semiHidden="1" w:uiPriority="153" w:unhideWhenUsed="1"/>
-    <w:lsdException w:name="Table Grid 6" w:semiHidden="1" w:uiPriority="153" w:unhideWhenUsed="1"/>
-    <w:lsdException w:name="Table Grid 7" w:semiHidden="1" w:uiPriority="153" w:unhideWhenUsed="1"/>
-    <w:lsdException w:name="Table Grid 8" w:semiHidden="1" w:uiPriority="153" w:unhideWhenUsed="1"/>
-    <w:lsdException w:name="Table List 1" w:semiHidden="1" w:uiPriority="153" w:unhideWhenUsed="1"/>
-    <w:lsdException w:name="Table List 2" w:semiHidden="1" w:uiPriority="153" w:unhideWhenUsed="1"/>
-    <w:lsdException w:name="Table List 3" w:semiHidden="1" w:uiPriority="153" w:unhideWhenUsed="1"/>
-    <w:lsdException w:name="Table List 4" w:semiHidden="1" w:uiPriority="153" w:unhideWhenUsed="1"/>
-    <w:lsdException w:name="Table List 5" w:semiHidden="1" w:uiPriority="153" w:unhideWhenUsed="1"/>
-    <w:lsdException w:name="Table List 6" w:semiHidden="1" w:uiPriority="153" w:unhideWhenUsed="1"/>
-    <w:lsdException w:name="Table List 7" w:semiHidden="1" w:uiPriority="153" w:unhideWhenUsed="1"/>
-    <w:lsdException w:name="Table List 8" w:semiHidden="1" w:uiPriority="153" w:unhideWhenUsed="1"/>
-    <w:lsdException w:name="Table 3D effects 1" w:semiHidden="1" w:uiPriority="153" w:unhideWhenUsed="1"/>
-    <w:lsdException w:name="Table 3D effects 2" w:semiHidden="1" w:uiPriority="153" w:unhideWhenUsed="1"/>
-    <w:lsdException w:name="Table 3D effects 3" w:semiHidden="1" w:uiPriority="153" w:unhideWhenUsed="1"/>
-    <w:lsdException w:name="Table Contemporary" w:semiHidden="1" w:uiPriority="153" w:unhideWhenUsed="1"/>
-    <w:lsdException w:name="Table Elegant" w:semiHidden="1" w:uiPriority="153" w:unhideWhenUsed="1"/>
-    <w:lsdException w:name="Table Professional" w:semiHidden="1" w:uiPriority="153" w:unhideWhenUsed="1"/>
-    <w:lsdException w:name="Table Subtle 1" w:semiHidden="1" w:uiPriority="153" w:unhideWhenUsed="1"/>
-    <w:lsdException w:name="Table Subtle 2" w:semiHidden="1" w:uiPriority="153" w:unhideWhenUsed="1"/>
-    <w:lsdException w:name="Table Web 1" w:semiHidden="1" w:uiPriority="153" w:unhideWhenUsed="1"/>
-    <w:lsdException w:name="Table Web 2" w:semiHidden="1" w:uiPriority="153" w:unhideWhenUsed="1"/>
-    <w:lsdException w:name="Table Web 3" w:semiHidden="1" w:uiPriority="153" w:unhideWhenUsed="1"/>
-    <w:lsdException w:name="Balloon Text" w:semiHidden="1" w:uiPriority="153" w:unhideWhenUsed="1"/>
-    <w:lsdException w:name="Table Grid" w:uiPriority="135"/>
-    <w:lsdException w:name="Table Theme" w:semiHidden="1" w:uiPriority="153" w:unhideWhenUsed="1"/>
-    <w:lsdException w:name="Placeholder Text" w:semiHidden="1" w:uiPriority="153"/>
+    <w:lsdException w:name="Body Text" w:semiHidden="1" w:uiPriority="99" w:unhideWhenUsed="1"/>
+    <w:lsdException w:name="Body Text Indent" w:semiHidden="1" w:uiPriority="99" w:unhideWhenUsed="1"/>
+    <w:lsdException w:name="List Continue" w:semiHidden="1" w:uiPriority="99" w:unhideWhenUsed="1"/>
+    <w:lsdException w:name="List Continue 2" w:semiHidden="1" w:uiPriority="99" w:unhideWhenUsed="1"/>
+    <w:lsdException w:name="List Continue 3" w:semiHidden="1" w:uiPriority="99" w:unhideWhenUsed="1"/>
+    <w:lsdException w:name="List Continue 4" w:semiHidden="1" w:uiPriority="99" w:unhideWhenUsed="1"/>
+    <w:lsdException w:name="List Continue 5" w:semiHidden="1" w:uiPriority="99" w:unhideWhenUsed="1"/>
+    <w:lsdException w:name="Message Header" w:semiHidden="1" w:uiPriority="99" w:unhideWhenUsed="1"/>
+    <w:lsdException w:name="Subtitle" w:uiPriority="23" w:qFormat="1"/>
+    <w:lsdException w:name="Salutation" w:semiHidden="1" w:uiPriority="99" w:unhideWhenUsed="1"/>
+    <w:lsdException w:name="Date" w:semiHidden="1" w:uiPriority="99" w:unhideWhenUsed="1"/>
+    <w:lsdException w:name="Body Text First Indent" w:semiHidden="1" w:uiPriority="99" w:unhideWhenUsed="1"/>
+    <w:lsdException w:name="Body Text First Indent 2" w:semiHidden="1" w:uiPriority="99" w:unhideWhenUsed="1"/>
+    <w:lsdException w:name="Note Heading" w:semiHidden="1" w:uiPriority="99" w:unhideWhenUsed="1"/>
+    <w:lsdException w:name="Body Text 2" w:semiHidden="1" w:uiPriority="99" w:unhideWhenUsed="1"/>
+    <w:lsdException w:name="Body Text 3" w:semiHidden="1" w:uiPriority="99" w:unhideWhenUsed="1"/>
+    <w:lsdException w:name="Body Text Indent 2" w:semiHidden="1" w:uiPriority="99" w:unhideWhenUsed="1"/>
+    <w:lsdException w:name="Body Text Indent 3" w:semiHidden="1" w:uiPriority="99" w:unhideWhenUsed="1"/>
+    <w:lsdException w:name="Block Text" w:semiHidden="1" w:uiPriority="99" w:unhideWhenUsed="1"/>
+    <w:lsdException w:name="Hyperlink" w:semiHidden="1" w:uiPriority="99" w:unhideWhenUsed="1"/>
+    <w:lsdException w:name="FollowedHyperlink" w:semiHidden="1" w:uiPriority="99" w:unhideWhenUsed="1"/>
+    <w:lsdException w:name="Strong" w:uiPriority="52" w:qFormat="1"/>
+    <w:lsdException w:name="Emphasis" w:uiPriority="50" w:qFormat="1"/>
+    <w:lsdException w:name="Document Map" w:semiHidden="1" w:uiPriority="99" w:unhideWhenUsed="1"/>
+    <w:lsdException w:name="Plain Text" w:semiHidden="1" w:uiPriority="99" w:unhideWhenUsed="1"/>
+    <w:lsdException w:name="E-mail Signature" w:semiHidden="1" w:uiPriority="99" w:unhideWhenUsed="1"/>
+    <w:lsdException w:name="HTML Top of Form" w:semiHidden="1" w:uiPriority="99" w:unhideWhenUsed="1"/>
+    <w:lsdException w:name="HTML Bottom of Form" w:semiHidden="1" w:uiPriority="99" w:unhideWhenUsed="1"/>
+    <w:lsdException w:name="Normal (Web)" w:semiHidden="1" w:uiPriority="99" w:unhideWhenUsed="1"/>
+    <w:lsdException w:name="HTML Acronym" w:semiHidden="1" w:uiPriority="99" w:unhideWhenUsed="1"/>
+    <w:lsdException w:name="HTML Address" w:semiHidden="1" w:uiPriority="99" w:unhideWhenUsed="1"/>
+    <w:lsdException w:name="HTML Cite" w:semiHidden="1" w:uiPriority="99" w:unhideWhenUsed="1"/>
+    <w:lsdException w:name="HTML Code" w:semiHidden="1" w:uiPriority="99" w:unhideWhenUsed="1"/>
+    <w:lsdException w:name="HTML Definition" w:semiHidden="1" w:uiPriority="99" w:unhideWhenUsed="1"/>
+    <w:lsdException w:name="HTML Keyboard" w:semiHidden="1" w:uiPriority="99" w:unhideWhenUsed="1"/>
+    <w:lsdException w:name="HTML Preformatted" w:semiHidden="1" w:uiPriority="99" w:unhideWhenUsed="1"/>
+    <w:lsdException w:name="HTML Sample" w:semiHidden="1" w:uiPriority="99" w:unhideWhenUsed="1"/>
+    <w:lsdException w:name="HTML Typewriter" w:semiHidden="1" w:uiPriority="99" w:unhideWhenUsed="1"/>
+    <w:lsdException w:name="HTML Variable" w:semiHidden="1" w:uiPriority="99" w:unhideWhenUsed="1"/>
+    <w:lsdException w:name="Normal Table" w:semiHidden="1" w:uiPriority="99" w:unhideWhenUsed="1"/>
+    <w:lsdException w:name="annotation subject" w:semiHidden="1" w:uiPriority="99" w:unhideWhenUsed="1"/>
+    <w:lsdException w:name="No List" w:semiHidden="1" w:uiPriority="99" w:unhideWhenUsed="1"/>
+    <w:lsdException w:name="Outline List 1" w:semiHidden="1" w:uiPriority="99" w:unhideWhenUsed="1"/>
+    <w:lsdException w:name="Outline List 2" w:semiHidden="1" w:uiPriority="99" w:unhideWhenUsed="1"/>
+    <w:lsdException w:name="Outline List 3" w:semiHidden="1" w:uiPriority="99" w:unhideWhenUsed="1"/>
+    <w:lsdException w:name="Table Simple 1" w:semiHidden="1" w:uiPriority="99" w:unhideWhenUsed="1"/>
+    <w:lsdException w:name="Table Simple 2" w:semiHidden="1" w:uiPriority="99" w:unhideWhenUsed="1"/>
+    <w:lsdException w:name="Table Simple 3" w:semiHidden="1" w:uiPriority="99" w:unhideWhenUsed="1"/>
+    <w:lsdException w:name="Table Classic 1" w:semiHidden="1" w:uiPriority="99" w:unhideWhenUsed="1"/>
+    <w:lsdException w:name="Table Classic 2" w:semiHidden="1" w:uiPriority="99" w:unhideWhenUsed="1"/>
+    <w:lsdException w:name="Table Classic 3" w:semiHidden="1" w:uiPriority="99" w:unhideWhenUsed="1"/>
+    <w:lsdException w:name="Table Classic 4" w:semiHidden="1" w:uiPriority="99" w:unhideWhenUsed="1"/>
+    <w:lsdException w:name="Table Colorful 1" w:semiHidden="1" w:uiPriority="99" w:unhideWhenUsed="1"/>
+    <w:lsdException w:name="Table Colorful 2" w:semiHidden="1" w:uiPriority="99" w:unhideWhenUsed="1"/>
+    <w:lsdException w:name="Table Colorful 3" w:semiHidden="1" w:uiPriority="99" w:unhideWhenUsed="1"/>
+    <w:lsdException w:name="Table Columns 1" w:semiHidden="1" w:uiPriority="99" w:unhideWhenUsed="1"/>
+    <w:lsdException w:name="Table Columns 2" w:semiHidden="1" w:uiPriority="99" w:unhideWhenUsed="1"/>
+    <w:lsdException w:name="Table Columns 3" w:semiHidden="1" w:uiPriority="99" w:unhideWhenUsed="1"/>
+    <w:lsdException w:name="Table Columns 4" w:semiHidden="1" w:uiPriority="99" w:unhideWhenUsed="1"/>
+    <w:lsdException w:name="Table Columns 5" w:semiHidden="1" w:uiPriority="99" w:unhideWhenUsed="1"/>
+    <w:lsdException w:name="Table Grid 1" w:semiHidden="1" w:uiPriority="99" w:unhideWhenUsed="1"/>
+    <w:lsdException w:name="Table Grid 2" w:semiHidden="1" w:uiPriority="99" w:unhideWhenUsed="1"/>
+    <w:lsdException w:name="Table Grid 3" w:semiHidden="1" w:uiPriority="99" w:unhideWhenUsed="1"/>
+    <w:lsdException w:name="Table Grid 4" w:semiHidden="1" w:uiPriority="99" w:unhideWhenUsed="1"/>
+    <w:lsdException w:name="Table Grid 5" w:semiHidden="1" w:uiPriority="99" w:unhideWhenUsed="1"/>
+    <w:lsdException w:name="Table Grid 6" w:semiHidden="1" w:uiPriority="99" w:unhideWhenUsed="1"/>
+    <w:lsdException w:name="Table Grid 7" w:semiHidden="1" w:uiPriority="99" w:unhideWhenUsed="1"/>
+    <w:lsdException w:name="Table Grid 8" w:semiHidden="1" w:uiPriority="99" w:unhideWhenUsed="1"/>
+    <w:lsdException w:name="Table List 1" w:semiHidden="1" w:uiPriority="99" w:unhideWhenUsed="1"/>
+    <w:lsdException w:name="Table List 2" w:semiHidden="1" w:uiPriority="99" w:unhideWhenUsed="1"/>
+    <w:lsdException w:name="Table List 3" w:semiHidden="1" w:uiPriority="99" w:unhideWhenUsed="1"/>
+    <w:lsdException w:name="Table List 4" w:semiHidden="1" w:uiPriority="99" w:unhideWhenUsed="1"/>
+    <w:lsdException w:name="Table List 5" w:semiHidden="1" w:uiPriority="99" w:unhideWhenUsed="1"/>
+    <w:lsdException w:name="Table List 6" w:semiHidden="1" w:uiPriority="99" w:unhideWhenUsed="1"/>
+    <w:lsdException w:name="Table List 7" w:semiHidden="1" w:uiPriority="99" w:unhideWhenUsed="1"/>
+    <w:lsdException w:name="Table List 8" w:semiHidden="1" w:uiPriority="99" w:unhideWhenUsed="1"/>
+    <w:lsdException w:name="Table 3D effects 1" w:semiHidden="1" w:uiPriority="99" w:unhideWhenUsed="1"/>
+    <w:lsdException w:name="Table 3D effects 2" w:semiHidden="1" w:uiPriority="99" w:unhideWhenUsed="1"/>
+    <w:lsdException w:name="Table 3D effects 3" w:semiHidden="1" w:uiPriority="99" w:unhideWhenUsed="1"/>
+    <w:lsdException w:name="Table Contemporary" w:semiHidden="1" w:uiPriority="99" w:unhideWhenUsed="1"/>
+    <w:lsdException w:name="Table Elegant" w:semiHidden="1" w:uiPriority="99" w:unhideWhenUsed="1"/>
+    <w:lsdException w:name="Table Professional" w:semiHidden="1" w:uiPriority="99" w:unhideWhenUsed="1"/>
+    <w:lsdException w:name="Table Subtle 1" w:semiHidden="1" w:uiPriority="99" w:unhideWhenUsed="1"/>
+    <w:lsdException w:name="Table Subtle 2" w:semiHidden="1" w:uiPriority="99" w:unhideWhenUsed="1"/>
+    <w:lsdException w:name="Table Web 1" w:semiHidden="1" w:uiPriority="99" w:unhideWhenUsed="1"/>
+    <w:lsdException w:name="Table Web 2" w:semiHidden="1" w:uiPriority="99" w:unhideWhenUsed="1"/>
+    <w:lsdException w:name="Table Web 3" w:semiHidden="1" w:uiPriority="99" w:unhideWhenUsed="1"/>
+    <w:lsdException w:name="Balloon Text" w:semiHidden="1" w:uiPriority="99" w:unhideWhenUsed="1"/>
+    <w:lsdException w:name="Table Grid" w:uiPriority="87"/>
+    <w:lsdException w:name="Table Theme" w:semiHidden="1" w:uiPriority="99" w:unhideWhenUsed="1"/>
+    <w:lsdException w:name="Placeholder Text" w:semiHidden="1" w:uiPriority="99"/>
     <w:lsdException w:name="No Spacing" w:uiPriority="1" w:qFormat="1"/>
     <w:lsdException w:name="Light Shading"/>
     <w:lsdException w:name="Light List"/>
@@ -694,10 +488,10 @@
     <w:lsdException w:name="Medium Shading 1 Accent 1"/>
     <w:lsdException w:name="Medium Shading 2 Accent 1"/>
     <w:lsdException w:name="Medium List 1 Accent 1"/>
-    <w:lsdException w:name="Revision" w:semiHidden="1" w:uiPriority="153"/>
-    <w:lsdException w:name="List Paragraph" w:uiPriority="130" w:qFormat="1"/>
-    <w:lsdException w:name="Quote" w:uiPriority="101" w:qFormat="1"/>
-    <w:lsdException w:name="Intense Quote" w:uiPriority="114" w:qFormat="1"/>
+    <w:lsdException w:name="Revision" w:semiHidden="1" w:uiPriority="99"/>
+    <w:lsdException w:name="List Paragraph" w:uiPriority="82" w:qFormat="1"/>
+    <w:lsdException w:name="Quote" w:uiPriority="65" w:qFormat="1"/>
+    <w:lsdException w:name="Intense Quote" w:uiPriority="72" w:qFormat="1"/>
     <w:lsdException w:name="Medium List 2 Accent 1"/>
     <w:lsdException w:name="Medium Grid 1 Accent 1"/>
     <w:lsdException w:name="Medium Grid 2 Accent 1"/>
@@ -776,27 +570,27 @@
     <w:lsdException w:name="Colorful Shading Accent 6"/>
     <w:lsdException w:name="Colorful List Accent 6"/>
     <w:lsdException w:name="Colorful Grid Accent 6"/>
-    <w:lsdException w:name="Subtle Emphasis" w:uiPriority="55" w:qFormat="1"/>
-    <w:lsdException w:name="Intense Emphasis" w:uiPriority="81" w:qFormat="1"/>
-    <w:lsdException w:name="Subtle Reference" w:uiPriority="115" w:qFormat="1"/>
-    <w:lsdException w:name="Intense Reference" w:uiPriority="128" w:qFormat="1"/>
-    <w:lsdException w:name="Book Title" w:uiPriority="129" w:qFormat="1"/>
-    <w:lsdException w:name="Bibliography" w:semiHidden="1" w:uiPriority="133" w:unhideWhenUsed="1"/>
-    <w:lsdException w:name="TOC Heading" w:semiHidden="1" w:uiPriority="135" w:unhideWhenUsed="1" w:qFormat="1"/>
-    <w:lsdException w:name="Mention" w:semiHidden="1" w:uiPriority="153" w:unhideWhenUsed="1"/>
-    <w:lsdException w:name="Smart Hyperlink" w:semiHidden="1" w:uiPriority="153" w:unhideWhenUsed="1"/>
-    <w:lsdException w:name="Hashtag" w:semiHidden="1" w:uiPriority="153" w:unhideWhenUsed="1"/>
-    <w:lsdException w:name="Unresolved Mention" w:semiHidden="1" w:uiPriority="153" w:unhideWhenUsed="1"/>
-    <w:lsdException w:name="Smart Link" w:semiHidden="1" w:uiPriority="153" w:unhideWhenUsed="1"/>
+    <w:lsdException w:name="Subtle Emphasis" w:uiPriority="37" w:qFormat="1"/>
+    <w:lsdException w:name="Intense Emphasis" w:uiPriority="51" w:qFormat="1"/>
+    <w:lsdException w:name="Subtle Reference" w:uiPriority="73" w:qFormat="1"/>
+    <w:lsdException w:name="Intense Reference" w:uiPriority="80" w:qFormat="1"/>
+    <w:lsdException w:name="Book Title" w:uiPriority="81" w:qFormat="1"/>
+    <w:lsdException w:name="Bibliography" w:semiHidden="1" w:uiPriority="85" w:unhideWhenUsed="1"/>
+    <w:lsdException w:name="TOC Heading" w:semiHidden="1" w:uiPriority="87" w:unhideWhenUsed="1" w:qFormat="1"/>
+    <w:lsdException w:name="Mention" w:semiHidden="1" w:uiPriority="99" w:unhideWhenUsed="1"/>
+    <w:lsdException w:name="Smart Hyperlink" w:semiHidden="1" w:uiPriority="99" w:unhideWhenUsed="1"/>
+    <w:lsdException w:name="Hashtag" w:semiHidden="1" w:uiPriority="99" w:unhideWhenUsed="1"/>
+    <w:lsdException w:name="Unresolved Mention" w:semiHidden="1" w:uiPriority="99" w:unhideWhenUsed="1"/>
+    <w:lsdException w:name="Smart Link" w:semiHidden="1" w:uiPriority="99" w:unhideWhenUsed="1"/>
   </w:latentStyles>
   <w:style w:type="paragraph" w:default="1" w:styleId="a">
     <w:name w:val="Normal"/>
     <w:qFormat/>
     <w:pPr>
-      <w:autoSpaceDE w:val="off"/>
-      <w:autoSpaceDN w:val="off"/>
-      <w:widowControl w:val="off"/>
-      <w:wordWrap w:val="off"/>
+      <w:widowControl w:val="0"/>
+      <w:wordWrap w:val="0"/>
+      <w:autoSpaceDE w:val="0"/>
+      <w:autoSpaceDN w:val="0"/>
     </w:pPr>
     <w:rPr>
       <w:sz w:val="22"/>
@@ -925,7 +719,7 @@
     <w:unhideWhenUsed/>
     <w:rPr>
       <w:color w:val="0563C1"/>
-      <w:u w:val="single" w:color="auto"/>
+      <w:u w:val="single"/>
     </w:rPr>
   </w:style>
   <w:style w:type="character" w:styleId="a6">
@@ -939,15 +733,15 @@
   </w:style>
   <w:style w:type="paragraph" w:styleId="a7">
     <w:name w:val="footnote text"/>
-    <w:uiPriority w:val="99"/>
     <w:link w:val="Char"/>
+    <w:uiPriority w:val="99"/>
     <w:semiHidden/>
     <w:unhideWhenUsed/>
   </w:style>
   <w:style w:type="character" w:customStyle="1" w:styleId="Char">
     <w:name w:val="각주 텍스트 Char"/>
-    <w:uiPriority w:val="99"/>
     <w:link w:val="a7"/>
+    <w:uiPriority w:val="99"/>
     <w:semiHidden/>
     <w:unhideWhenUsed/>
     <w:rPr>
@@ -966,15 +760,15 @@
   </w:style>
   <w:style w:type="paragraph" w:styleId="a9">
     <w:name w:val="endnote text"/>
-    <w:uiPriority w:val="99"/>
     <w:link w:val="Char0"/>
+    <w:uiPriority w:val="99"/>
     <w:semiHidden/>
     <w:unhideWhenUsed/>
   </w:style>
   <w:style w:type="character" w:customStyle="1" w:styleId="Char0">
     <w:name w:val="미주 텍스트 Char"/>
-    <w:uiPriority w:val="99"/>
     <w:link w:val="a9"/>
+    <w:uiPriority w:val="99"/>
     <w:semiHidden/>
     <w:unhideWhenUsed/>
     <w:rPr>
@@ -984,22 +778,24 @@
   </w:style>
   <w:style w:type="paragraph" w:styleId="aa">
     <w:name w:val="header"/>
-    <w:uiPriority w:val="99"/>
     <w:basedOn w:val="a"/>
     <w:link w:val="Char1"/>
+    <w:uiPriority w:val="99"/>
     <w:unhideWhenUsed/>
+    <w:rsid w:val="00FA4922"/>
     <w:pPr>
-      <w:snapToGrid w:val="0"/>
       <w:tabs>
         <w:tab w:val="center" w:pos="4513"/>
         <w:tab w:val="right" w:pos="9026"/>
       </w:tabs>
+      <w:snapToGrid w:val="0"/>
     </w:pPr>
   </w:style>
   <w:style w:type="character" w:customStyle="1" w:styleId="Char1">
     <w:name w:val="머리글 Char"/>
-    <w:uiPriority w:val="99"/>
     <w:link w:val="aa"/>
+    <w:uiPriority w:val="99"/>
+    <w:rsid w:val="00FA4922"/>
     <w:rPr>
       <w:sz w:val="22"/>
       <w:szCs w:val="22"/>
@@ -1007,22 +803,24 @@
   </w:style>
   <w:style w:type="paragraph" w:styleId="ab">
     <w:name w:val="footer"/>
-    <w:uiPriority w:val="99"/>
     <w:basedOn w:val="a"/>
     <w:link w:val="Char2"/>
+    <w:uiPriority w:val="99"/>
     <w:unhideWhenUsed/>
+    <w:rsid w:val="00FA4922"/>
     <w:pPr>
-      <w:snapToGrid w:val="0"/>
       <w:tabs>
         <w:tab w:val="center" w:pos="4513"/>
         <w:tab w:val="right" w:pos="9026"/>
       </w:tabs>
+      <w:snapToGrid w:val="0"/>
     </w:pPr>
   </w:style>
   <w:style w:type="character" w:customStyle="1" w:styleId="Char2">
     <w:name w:val="바닥글 Char"/>
-    <w:uiPriority w:val="99"/>
     <w:link w:val="ab"/>
+    <w:uiPriority w:val="99"/>
+    <w:rsid w:val="00FA4922"/>
     <w:rPr>
       <w:sz w:val="22"/>
       <w:szCs w:val="22"/>

</xml_diff>